<commit_message>
Updated 5.1 release notes and todo-list
</commit_message>
<xml_diff>
--- a/Documentation/Official Documentation/Release Notes/Release Notes for version 5.1.0.0.docx
+++ b/Documentation/Official Documentation/Release Notes/Release Notes for version 5.1.0.0.docx
@@ -78,6 +78,65 @@
       <w:r>
         <w:rPr/>
         <w:t>When a measure contains PartMeasureRepeat and grouping the Grouping may be wrong. Fixed by applying expansion og PartMEasureRepeat BEFORE interpreting grouping.</w:t>
+      </w:r>
+    </w:p>
+    <w:p>
+      <w:pPr>
+        <w:pStyle w:val="Normal"/>
+        <w:numPr>
+          <w:ilvl w:val="0"/>
+          <w:numId w:val="0"/>
+        </w:numPr>
+        <w:bidi w:val="0"/>
+        <w:ind w:start="720" w:hanging="0"/>
+        <w:jc w:val="start"/>
+        <w:rPr/>
+      </w:pPr>
+      <w:r>
+        <w:rPr/>
+      </w:r>
+    </w:p>
+    <w:p>
+      <w:pPr>
+        <w:pStyle w:val="Normal"/>
+        <w:numPr>
+          <w:ilvl w:val="0"/>
+          <w:numId w:val="2"/>
+        </w:numPr>
+        <w:bidi w:val="0"/>
+        <w:jc w:val="start"/>
+        <w:rPr/>
+      </w:pPr>
+      <w:r>
+        <w:rPr/>
+        <w:t>Reading of OctoBraille_1252 wrapped in a second layer of utf8</w:t>
+      </w:r>
+    </w:p>
+    <w:p>
+      <w:pPr>
+        <w:pStyle w:val="Normal"/>
+        <w:bidi w:val="0"/>
+        <w:jc w:val="start"/>
+        <w:rPr/>
+      </w:pPr>
+      <w:r>
+        <w:rPr/>
+      </w:r>
+    </w:p>
+    <w:p>
+      <w:pPr>
+        <w:pStyle w:val="Normal"/>
+        <w:numPr>
+          <w:ilvl w:val="0"/>
+          <w:numId w:val="2"/>
+        </w:numPr>
+        <w:bidi w:val="0"/>
+        <w:jc w:val="start"/>
+        <w:rPr/>
+      </w:pPr>
+      <w:r>
+        <w:rPr/>
+        <w:t>Reporting through MessageBoxes of several errors related to the initial decoding of raw Braille files.</w:t>
       </w:r>
     </w:p>
     <w:p>

</xml_diff>